<commit_message>
updated instruction file and README file
</commit_message>
<xml_diff>
--- a/docs/SharedFiles/The full guide for Transport and Employees systems.docx
+++ b/docs/SharedFiles/The full guide for Transport and Employees systems.docx
@@ -27,7 +27,7 @@
             <mc:AlternateContent>
               <mc:Choice Requires="wps">
                 <w:drawing>
-                  <wp:anchor distT="0" distB="0" distL="114300" distR="114300" simplePos="0" relativeHeight="251664384" behindDoc="1" locked="0" layoutInCell="1" allowOverlap="1" wp14:anchorId="2BE5EE22" wp14:editId="47DA3E12">
+                  <wp:anchor distT="0" distB="0" distL="114300" distR="114300" simplePos="0" relativeHeight="251664384" behindDoc="1" locked="0" layoutInCell="1" allowOverlap="1" wp14:anchorId="2BE5EE22" wp14:editId="7939B6CE">
                     <wp:simplePos x="0" y="0"/>
                     <wp:positionH relativeFrom="page">
                       <wp:align>center</wp:align>
@@ -36,7 +36,7 @@
                       <wp:align>center</wp:align>
                     </wp:positionV>
                     <wp:extent cx="7383780" cy="9555480"/>
-                    <wp:effectExtent l="7620" t="0" r="0" b="7620"/>
+                    <wp:effectExtent l="0" t="0" r="7620" b="7620"/>
                     <wp:wrapNone/>
                     <wp:docPr id="466" name="מלבן 257"/>
                     <wp:cNvGraphicFramePr>
@@ -280,7 +280,6 @@
                               <w:r>
                                 <w:rPr>
                                   <w:color w:val="FFFFFF" w:themeColor="background1"/>
-                                  <w:lang w:val="en-US"/>
                                 </w:rPr>
                                 <w:t>Full instructions guide for Employees and Transport systems.</w:t>
                               </w:r>
@@ -685,7 +684,6 @@
                                   <w:color w:val="156082" w:themeColor="accent1"/>
                                   <w:sz w:val="72"/>
                                   <w:szCs w:val="72"/>
-                                  <w:lang w:val="en-US"/>
                                 </w:rPr>
                                 <w:t>The ultimate guide for transport and employees' systems.</w:t>
                               </w:r>
@@ -753,7 +751,197 @@
             <mc:AlternateContent>
               <mc:Choice Requires="wps">
                 <w:drawing>
-                  <wp:anchor distT="0" distB="0" distL="114300" distR="114300" simplePos="0" relativeHeight="251665408" behindDoc="0" locked="0" layoutInCell="1" allowOverlap="1" wp14:anchorId="495B3D3D" wp14:editId="548B605F">
+                  <wp:anchor distT="0" distB="0" distL="114300" distR="114300" simplePos="0" relativeHeight="251666432" behindDoc="0" locked="0" layoutInCell="1" allowOverlap="1" wp14:anchorId="416F1E28" wp14:editId="5E83ECFF">
+                    <wp:simplePos x="0" y="0"/>
+                    <wp:positionH relativeFrom="column">
+                      <wp:posOffset>-663452</wp:posOffset>
+                    </wp:positionH>
+                    <wp:positionV relativeFrom="paragraph">
+                      <wp:posOffset>7165300</wp:posOffset>
+                    </wp:positionV>
+                    <wp:extent cx="2413820" cy="1312607"/>
+                    <wp:effectExtent l="0" t="0" r="24765" b="20955"/>
+                    <wp:wrapNone/>
+                    <wp:docPr id="1548963765" name="Text Box 7"/>
+                    <wp:cNvGraphicFramePr/>
+                    <a:graphic xmlns:a="http://schemas.openxmlformats.org/drawingml/2006/main">
+                      <a:graphicData uri="http://schemas.microsoft.com/office/word/2010/wordprocessingShape">
+                        <wps:wsp>
+                          <wps:cNvSpPr txBox="1"/>
+                          <wps:spPr>
+                            <a:xfrm>
+                              <a:off x="0" y="0"/>
+                              <a:ext cx="2413820" cy="1312607"/>
+                            </a:xfrm>
+                            <a:prstGeom prst="rect">
+                              <a:avLst/>
+                            </a:prstGeom>
+                            <a:noFill/>
+                            <a:ln w="6350">
+                              <a:solidFill>
+                                <a:prstClr val="black"/>
+                              </a:solidFill>
+                            </a:ln>
+                          </wps:spPr>
+                          <wps:txbx>
+                            <w:txbxContent>
+                              <w:p>
+                                <w:pPr>
+                                  <w:rPr>
+                                    <w:b/>
+                                    <w:bCs/>
+                                    <w:u w:val="single"/>
+                                  </w:rPr>
+                                </w:pPr>
+                                <w:r>
+                                  <w:rPr>
+                                    <w:b/>
+                                    <w:bCs/>
+                                    <w:u w:val="single"/>
+                                  </w:rPr>
+                                  <w:t>Names and IDs:</w:t>
+                                </w:r>
+                              </w:p>
+                              <w:p>
+                                <w:r>
+                                  <w:t xml:space="preserve">Yael </w:t>
+                                </w:r>
+                                <w:proofErr w:type="gramStart"/>
+                                <w:r>
+                                  <w:t>Durahly  |</w:t>
+                                </w:r>
+                                <w:proofErr w:type="gramEnd"/>
+                                <w:r>
+                                  <w:t xml:space="preserve"> </w:t>
+                                </w:r>
+                                <w:r>
+                                  <w:t>212985535</w:t>
+                                </w:r>
+                                <w:r>
+                                  <w:br/>
+                                  <w:t>Denis Coleman</w:t>
+                                </w:r>
+                                <w:r>
+                                  <w:t xml:space="preserve"> | </w:t>
+                                </w:r>
+                                <w:r>
+                                  <w:t>211408356</w:t>
+                                </w:r>
+                                <w:r>
+                                  <w:br/>
+                                </w:r>
+                                <w:r>
+                                  <w:t>Tom Gluzman |</w:t>
+                                </w:r>
+                                <w:r>
+                                  <w:t xml:space="preserve"> </w:t>
+                                </w:r>
+                                <w:r>
+                                  <w:t>322861477</w:t>
+                                </w:r>
+                                <w:r>
+                                  <w:br/>
+                                  <w:t>Ethen Krimer | 323888412</w:t>
+                                </w:r>
+                              </w:p>
+                              <w:p/>
+                            </w:txbxContent>
+                          </wps:txbx>
+                          <wps:bodyPr rot="0" spcFirstLastPara="0" vertOverflow="overflow" horzOverflow="overflow" vert="horz" wrap="square" lIns="91440" tIns="45720" rIns="91440" bIns="45720" numCol="1" spcCol="0" rtlCol="1" fromWordArt="0" anchor="t" anchorCtr="0" forceAA="0" compatLnSpc="1">
+                            <a:prstTxWarp prst="textNoShape">
+                              <a:avLst/>
+                            </a:prstTxWarp>
+                            <a:noAutofit/>
+                          </wps:bodyPr>
+                        </wps:wsp>
+                      </a:graphicData>
+                    </a:graphic>
+                    <wp14:sizeRelV relativeFrom="margin">
+                      <wp14:pctHeight>0</wp14:pctHeight>
+                    </wp14:sizeRelV>
+                  </wp:anchor>
+                </w:drawing>
+              </mc:Choice>
+              <mc:Fallback>
+                <w:pict>
+                  <v:shape w14:anchorId="416F1E28" id="Text Box 7" o:spid="_x0000_s1029" type="#_x0000_t202" style="position:absolute;margin-left:-52.25pt;margin-top:564.2pt;width:190.05pt;height:103.35pt;z-index:251666432;visibility:visible;mso-wrap-style:square;mso-height-percent:0;mso-wrap-distance-left:9pt;mso-wrap-distance-top:0;mso-wrap-distance-right:9pt;mso-wrap-distance-bottom:0;mso-position-horizontal:absolute;mso-position-horizontal-relative:text;mso-position-vertical:absolute;mso-position-vertical-relative:text;mso-height-percent:0;mso-height-relative:margin;v-text-anchor:top" o:gfxdata="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" filled="f" strokeweight=".5pt">
+                    <v:textbox>
+                      <w:txbxContent>
+                        <w:p>
+                          <w:pPr>
+                            <w:rPr>
+                              <w:b/>
+                              <w:bCs/>
+                              <w:u w:val="single"/>
+                            </w:rPr>
+                          </w:pPr>
+                          <w:r>
+                            <w:rPr>
+                              <w:b/>
+                              <w:bCs/>
+                              <w:u w:val="single"/>
+                            </w:rPr>
+                            <w:t>Names and IDs:</w:t>
+                          </w:r>
+                        </w:p>
+                        <w:p>
+                          <w:r>
+                            <w:t xml:space="preserve">Yael </w:t>
+                          </w:r>
+                          <w:proofErr w:type="gramStart"/>
+                          <w:r>
+                            <w:t>Durahly  |</w:t>
+                          </w:r>
+                          <w:proofErr w:type="gramEnd"/>
+                          <w:r>
+                            <w:t xml:space="preserve"> </w:t>
+                          </w:r>
+                          <w:r>
+                            <w:t>212985535</w:t>
+                          </w:r>
+                          <w:r>
+                            <w:br/>
+                            <w:t>Denis Coleman</w:t>
+                          </w:r>
+                          <w:r>
+                            <w:t xml:space="preserve"> | </w:t>
+                          </w:r>
+                          <w:r>
+                            <w:t>211408356</w:t>
+                          </w:r>
+                          <w:r>
+                            <w:br/>
+                          </w:r>
+                          <w:r>
+                            <w:t>Tom Gluzman |</w:t>
+                          </w:r>
+                          <w:r>
+                            <w:t xml:space="preserve"> </w:t>
+                          </w:r>
+                          <w:r>
+                            <w:t>322861477</w:t>
+                          </w:r>
+                          <w:r>
+                            <w:br/>
+                            <w:t>Ethen Krimer | 323888412</w:t>
+                          </w:r>
+                        </w:p>
+                        <w:p/>
+                      </w:txbxContent>
+                    </v:textbox>
+                  </v:shape>
+                </w:pict>
+              </mc:Fallback>
+            </mc:AlternateContent>
+          </w:r>
+          <w:r>
+            <w:rPr>
+              <w:noProof/>
+            </w:rPr>
+            <mc:AlternateContent>
+              <mc:Choice Requires="wps">
+                <w:drawing>
+                  <wp:anchor distT="0" distB="0" distL="114300" distR="114300" simplePos="0" relativeHeight="251665408" behindDoc="0" locked="0" layoutInCell="1" allowOverlap="1" wp14:anchorId="495B3D3D" wp14:editId="31191EBB">
                     <wp:simplePos x="0" y="0"/>
                     <wp:positionH relativeFrom="page">
                       <wp:posOffset>1439839</wp:posOffset>
@@ -788,7 +976,7 @@
                             <w:txbxContent>
                               <w:p>
                                 <w:pPr>
-                                  <w:pStyle w:val="ae"/>
+                                  <w:pStyle w:val="NoSpacing"/>
                                   <w:rPr>
                                     <w:color w:val="0E2841" w:themeColor="text2"/>
                                     <w:rtl/>
@@ -810,7 +998,21 @@
                                       <w:rPr>
                                         <w:color w:val="0E2841" w:themeColor="text2"/>
                                       </w:rPr>
-                                      <w:t>Denis Coleman, Yael Durahly, Ethen Krimer, Tom Gluzman</w:t>
+                                      <w:t xml:space="preserve">Denis Coleman, Yael Durahly, Ethen </w:t>
+                                    </w:r>
+                                    <w:proofErr w:type="spellStart"/>
+                                    <w:r>
+                                      <w:rPr>
+                                        <w:color w:val="0E2841" w:themeColor="text2"/>
+                                      </w:rPr>
+                                      <w:t>Krimer</w:t>
+                                    </w:r>
+                                    <w:proofErr w:type="spellEnd"/>
+                                    <w:r>
+                                      <w:rPr>
+                                        <w:color w:val="0E2841" w:themeColor="text2"/>
+                                      </w:rPr>
+                                      <w:t>, Tom Gluzman</w:t>
                                     </w:r>
                                   </w:sdtContent>
                                 </w:sdt>
@@ -837,14 +1039,13 @@
               </mc:Choice>
               <mc:Fallback>
                 <w:pict>
-                  <v:shape w14:anchorId="495B3D3D" id="תיבת טקסט 255" o:spid="_x0000_s1029" type="#_x0000_t202" style="position:absolute;margin-left:113.35pt;margin-top:499.15pt;width:220.3pt;height:44pt;flip:x;z-index:251665408;visibility:visible;mso-wrap-style:square;mso-width-percent:360;mso-height-percent:0;mso-wrap-distance-left:9pt;mso-wrap-distance-top:0;mso-wrap-distance-right:9pt;mso-wrap-distance-bottom:0;mso-position-horizontal:absolute;mso-position-horizontal-relative:page;mso-position-vertical:absolute;mso-position-vertical-relative:page;mso-width-percent:360;mso-height-percent:0;mso-width-relative:page;mso-height-relative:margin;v-text-anchor:bottom" o:gfxdata="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" filled="f" stroked="f" strokeweight=".5pt">
+                  <v:shape w14:anchorId="495B3D3D" id="תיבת טקסט 255" o:spid="_x0000_s1030" type="#_x0000_t202" style="position:absolute;margin-left:113.35pt;margin-top:499.15pt;width:220.3pt;height:44pt;flip:x;z-index:251665408;visibility:visible;mso-wrap-style:square;mso-width-percent:360;mso-height-percent:0;mso-wrap-distance-left:9pt;mso-wrap-distance-top:0;mso-wrap-distance-right:9pt;mso-wrap-distance-bottom:0;mso-position-horizontal:absolute;mso-position-horizontal-relative:page;mso-position-vertical:absolute;mso-position-vertical-relative:page;mso-width-percent:360;mso-height-percent:0;mso-width-relative:page;mso-height-relative:margin;v-text-anchor:bottom" o:gfxdata="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" filled="f" stroked="f" strokeweight=".5pt">
                     <v:textbox>
                       <w:txbxContent>
                         <w:p>
                           <w:pPr>
-                            <w:pStyle w:val="ae"/>
+                            <w:pStyle w:val="NoSpacing"/>
                             <w:rPr>
-                              <w:rFonts w:hint="cs"/>
                               <w:color w:val="0E2841" w:themeColor="text2"/>
                               <w:rtl/>
                             </w:rPr>
@@ -865,7 +1066,21 @@
                                 <w:rPr>
                                   <w:color w:val="0E2841" w:themeColor="text2"/>
                                 </w:rPr>
-                                <w:t>Denis Coleman, Yael Durahly, Ethen Krimer, Tom Gluzman</w:t>
+                                <w:t xml:space="preserve">Denis Coleman, Yael Durahly, Ethen </w:t>
+                              </w:r>
+                              <w:proofErr w:type="spellStart"/>
+                              <w:r>
+                                <w:rPr>
+                                  <w:color w:val="0E2841" w:themeColor="text2"/>
+                                </w:rPr>
+                                <w:t>Krimer</w:t>
+                              </w:r>
+                              <w:proofErr w:type="spellEnd"/>
+                              <w:r>
+                                <w:rPr>
+                                  <w:color w:val="0E2841" w:themeColor="text2"/>
+                                </w:rPr>
+                                <w:t>, Tom Gluzman</w:t>
                               </w:r>
                             </w:sdtContent>
                           </w:sdt>
@@ -3612,7 +3827,7 @@
     </w:p>
     <w:p>
       <w:pPr>
-        <w:pStyle w:val="a9"/>
+        <w:pStyle w:val="ListParagraph"/>
         <w:numPr>
           <w:ilvl w:val="0"/>
           <w:numId w:val="45"/>
@@ -4043,7 +4258,7 @@
     </w:p>
     <w:p>
       <w:pPr>
-        <w:pStyle w:val="a9"/>
+        <w:pStyle w:val="ListParagraph"/>
         <w:numPr>
           <w:ilvl w:val="0"/>
           <w:numId w:val="5"/>
@@ -4056,10 +4271,34 @@
         <w:t>permanently,</w:t>
       </w:r>
       <w:r>
-        <w:t xml:space="preserve"> meaning every change he does will be affective </w:t>
-      </w:r>
-      <w:r>
-        <w:t>from this point forward until he will decide otherwise.</w:t>
+        <w:t xml:space="preserve"> meaning every change he </w:t>
+      </w:r>
+      <w:proofErr w:type="gramStart"/>
+      <w:r>
+        <w:t>does</w:t>
+      </w:r>
+      <w:proofErr w:type="gramEnd"/>
+      <w:r>
+        <w:t xml:space="preserve"> will be </w:t>
+      </w:r>
+      <w:proofErr w:type="gramStart"/>
+      <w:r>
+        <w:t>affective</w:t>
+      </w:r>
+      <w:proofErr w:type="gramEnd"/>
+      <w:r>
+        <w:t xml:space="preserve"> </w:t>
+      </w:r>
+      <w:r>
+        <w:t xml:space="preserve">from this point forward until he </w:t>
+      </w:r>
+      <w:proofErr w:type="gramStart"/>
+      <w:r>
+        <w:t>will decide</w:t>
+      </w:r>
+      <w:proofErr w:type="gramEnd"/>
+      <w:r>
+        <w:t xml:space="preserve"> otherwise.</w:t>
       </w:r>
       <w:r>
         <w:br/>
@@ -4068,14 +4307,22 @@
     </w:p>
     <w:p>
       <w:pPr>
-        <w:pStyle w:val="a9"/>
+        <w:pStyle w:val="ListParagraph"/>
         <w:numPr>
           <w:ilvl w:val="0"/>
           <w:numId w:val="5"/>
         </w:numPr>
       </w:pPr>
       <w:r>
-        <w:t xml:space="preserve">The system holds Past Shifts up to 7 </w:t>
+        <w:t xml:space="preserve">The system holds Past </w:t>
+      </w:r>
+      <w:proofErr w:type="gramStart"/>
+      <w:r>
+        <w:t>Shifts</w:t>
+      </w:r>
+      <w:proofErr w:type="gramEnd"/>
+      <w:r>
+        <w:t xml:space="preserve"> up to 7 </w:t>
       </w:r>
       <w:r>
         <w:t>years,</w:t>
@@ -4086,14 +4333,22 @@
     </w:p>
     <w:p>
       <w:pPr>
-        <w:pStyle w:val="a9"/>
+        <w:pStyle w:val="ListParagraph"/>
         <w:numPr>
           <w:ilvl w:val="0"/>
           <w:numId w:val="5"/>
         </w:numPr>
       </w:pPr>
       <w:r>
-        <w:t xml:space="preserve">The system accommodates fully the User throughout his use of the system, no user will be left out. </w:t>
+        <w:t xml:space="preserve">The system accommodates fully the User throughout his use of the </w:t>
+      </w:r>
+      <w:proofErr w:type="gramStart"/>
+      <w:r>
+        <w:t>system,</w:t>
+      </w:r>
+      <w:proofErr w:type="gramEnd"/>
+      <w:r>
+        <w:t xml:space="preserve"> no user will be left out. </w:t>
       </w:r>
       <w:r>
         <w:t>The</w:t>
@@ -4168,7 +4423,15 @@
     </w:p>
     <w:p>
       <w:r>
-        <w:t xml:space="preserve">By default, the system does not require a login. If access control is introduced, usernames </w:t>
+        <w:t xml:space="preserve">By default, the system does not require </w:t>
+      </w:r>
+      <w:proofErr w:type="gramStart"/>
+      <w:r>
+        <w:t>a login</w:t>
+      </w:r>
+      <w:proofErr w:type="gramEnd"/>
+      <w:r>
+        <w:t xml:space="preserve">. If access control is introduced, usernames </w:t>
       </w:r>
     </w:p>
     <w:p>
@@ -4200,7 +4463,15 @@
     </w:p>
     <w:p>
       <w:r>
-        <w:t xml:space="preserve">efficiently create, monitor, and manage transports between suppliers and branches using </w:t>
+        <w:t xml:space="preserve">efficiently create, monitor, and manage </w:t>
+      </w:r>
+      <w:proofErr w:type="gramStart"/>
+      <w:r>
+        <w:t>transports</w:t>
+      </w:r>
+      <w:proofErr w:type="gramEnd"/>
+      <w:r>
+        <w:t xml:space="preserve"> between suppliers and branches using </w:t>
       </w:r>
     </w:p>
     <w:p>
@@ -4245,7 +4516,15 @@
     </w:p>
     <w:p>
       <w:r>
-        <w:t xml:space="preserve">2. Navigate to the project directory. </w:t>
+        <w:t xml:space="preserve">2. </w:t>
+      </w:r>
+      <w:proofErr w:type="gramStart"/>
+      <w:r>
+        <w:t>Navigate to</w:t>
+      </w:r>
+      <w:proofErr w:type="gramEnd"/>
+      <w:r>
+        <w:t xml:space="preserve"> the project directory. </w:t>
       </w:r>
     </w:p>
     <w:p>
@@ -4369,12 +4648,36 @@
           <w:b/>
           <w:bCs/>
         </w:rPr>
-        <w:t xml:space="preserve">Creating a Transport </w:t>
-      </w:r>
-    </w:p>
-    <w:p>
-      <w:r>
-        <w:t xml:space="preserve">To create a transport: </w:t>
+        <w:t xml:space="preserve">Creating </w:t>
+      </w:r>
+      <w:proofErr w:type="gramStart"/>
+      <w:r>
+        <w:rPr>
+          <w:b/>
+          <w:bCs/>
+        </w:rPr>
+        <w:t>a Transport</w:t>
+      </w:r>
+      <w:proofErr w:type="gramEnd"/>
+      <w:r>
+        <w:rPr>
+          <w:b/>
+          <w:bCs/>
+        </w:rPr>
+        <w:t xml:space="preserve"> </w:t>
+      </w:r>
+    </w:p>
+    <w:p>
+      <w:r>
+        <w:t xml:space="preserve">To create </w:t>
+      </w:r>
+      <w:proofErr w:type="gramStart"/>
+      <w:r>
+        <w:t>a transport</w:t>
+      </w:r>
+      <w:proofErr w:type="gramEnd"/>
+      <w:r>
+        <w:t xml:space="preserve">: </w:t>
       </w:r>
     </w:p>
     <w:p>
@@ -4414,7 +4717,15 @@
     </w:p>
     <w:p>
       <w:r>
-        <w:t xml:space="preserve">8. Upon success, a full transport is created and listed. </w:t>
+        <w:t xml:space="preserve">8. Upon success, a full </w:t>
+      </w:r>
+      <w:proofErr w:type="gramStart"/>
+      <w:r>
+        <w:t>transport</w:t>
+      </w:r>
+      <w:proofErr w:type="gramEnd"/>
+      <w:r>
+        <w:t xml:space="preserve"> is created and listed. </w:t>
       </w:r>
     </w:p>
     <w:p>
@@ -4952,7 +5263,15 @@
     </w:p>
     <w:p>
       <w:r>
-        <w:t xml:space="preserve">- Ensure there are available drivers and trucks for the given transport date. </w:t>
+        <w:t xml:space="preserve">- Ensure there are </w:t>
+      </w:r>
+      <w:proofErr w:type="gramStart"/>
+      <w:r>
+        <w:t>available drivers and trucks</w:t>
+      </w:r>
+      <w:proofErr w:type="gramEnd"/>
+      <w:r>
+        <w:t xml:space="preserve"> for the given transport date. </w:t>
       </w:r>
     </w:p>
     <w:p>
@@ -5097,6 +5416,7 @@
       </w:r>
     </w:p>
     <w:p>
+      <w:proofErr w:type="spellStart"/>
       <w:r>
         <w:rPr>
           <w:b/>
@@ -5104,6 +5424,7 @@
         </w:rPr>
         <w:t>antlr</w:t>
       </w:r>
+      <w:proofErr w:type="spellEnd"/>
       <w:r>
         <w:t xml:space="preserve"> – Used for parsing and analyzing structured text (like SQL or code)</w:t>
       </w:r>
@@ -5121,18 +5442,31 @@
       </w:r>
     </w:p>
     <w:p>
-      <w:r>
-        <w:rPr>
-          <w:b/>
-          <w:bCs/>
-        </w:rPr>
-        <w:t>hibernate.orm.community.dialects</w:t>
-      </w:r>
+      <w:proofErr w:type="spellStart"/>
+      <w:proofErr w:type="gramStart"/>
+      <w:r>
+        <w:rPr>
+          <w:b/>
+          <w:bCs/>
+        </w:rPr>
+        <w:t>hibernate.orm.community</w:t>
+      </w:r>
+      <w:proofErr w:type="gramEnd"/>
+      <w:r>
+        <w:rPr>
+          <w:b/>
+          <w:bCs/>
+        </w:rPr>
+        <w:t>.dialects</w:t>
+      </w:r>
+      <w:proofErr w:type="spellEnd"/>
       <w:r>
         <w:t xml:space="preserve"> – Contains additional SQL dialects for supporting various databases in Hibernate.</w:t>
       </w:r>
     </w:p>
     <w:p>
+      <w:proofErr w:type="spellStart"/>
+      <w:proofErr w:type="gramStart"/>
       <w:r>
         <w:rPr>
           <w:b/>
@@ -5140,11 +5474,14 @@
         </w:rPr>
         <w:t>hibernate.orm.core</w:t>
       </w:r>
+      <w:proofErr w:type="spellEnd"/>
+      <w:proofErr w:type="gramEnd"/>
       <w:r>
         <w:t xml:space="preserve"> – The main Hibernate ORM framework, enabling mapping Java classes to database tables and managing persistent data.</w:t>
       </w:r>
     </w:p>
     <w:p>
+      <w:proofErr w:type="spellStart"/>
       <w:r>
         <w:rPr>
           <w:b/>
@@ -5152,11 +5489,22 @@
         </w:rPr>
         <w:t>jakarta.persistence.api</w:t>
       </w:r>
-      <w:r>
-        <w:t xml:space="preserve"> – Provides the standard JPA interfaces (like Entity, EntityManager, etc.) which Hibernate implements.</w:t>
-      </w:r>
-    </w:p>
-    <w:p>
+      <w:proofErr w:type="spellEnd"/>
+      <w:r>
+        <w:t xml:space="preserve"> – Provides the standard JPA interfaces (like Entity, </w:t>
+      </w:r>
+      <w:proofErr w:type="spellStart"/>
+      <w:r>
+        <w:t>EntityManager</w:t>
+      </w:r>
+      <w:proofErr w:type="spellEnd"/>
+      <w:r>
+        <w:t>, etc.) which Hibernate implements.</w:t>
+      </w:r>
+    </w:p>
+    <w:p>
+      <w:proofErr w:type="spellStart"/>
+      <w:proofErr w:type="gramStart"/>
       <w:r>
         <w:rPr>
           <w:b/>
@@ -5165,6 +5513,8 @@
         <w:lastRenderedPageBreak/>
         <w:t>jboss.logging</w:t>
       </w:r>
+      <w:proofErr w:type="spellEnd"/>
+      <w:proofErr w:type="gramEnd"/>
       <w:r>
         <w:t xml:space="preserve"> – A logging framework used by Hibernate and related libraries for consistent, configurable logging.</w:t>
       </w:r>
@@ -5182,13 +5532,24 @@
       </w:r>
     </w:p>
     <w:p>
-      <w:r>
-        <w:rPr>
-          <w:b/>
-          <w:bCs/>
-        </w:rPr>
-        <w:t>xerial.sqlite.jdbc</w:t>
-      </w:r>
+      <w:proofErr w:type="spellStart"/>
+      <w:r>
+        <w:rPr>
+          <w:b/>
+          <w:bCs/>
+        </w:rPr>
+        <w:t>xerial.</w:t>
+      </w:r>
+      <w:proofErr w:type="gramStart"/>
+      <w:r>
+        <w:rPr>
+          <w:b/>
+          <w:bCs/>
+        </w:rPr>
+        <w:t>sqlite.jdbc</w:t>
+      </w:r>
+      <w:proofErr w:type="spellEnd"/>
+      <w:proofErr w:type="gramEnd"/>
       <w:r>
         <w:t xml:space="preserve"> – A JDBC driver that allows Java applications to connect to SQLite databases.</w:t>
       </w:r>
@@ -5268,7 +5629,7 @@
     <w:sdtContent>
       <w:p>
         <w:pPr>
-          <w:pStyle w:val="af2"/>
+          <w:pStyle w:val="Footer"/>
         </w:pPr>
         <w:r>
           <w:fldChar w:fldCharType="begin"/>
@@ -5294,7 +5655,7 @@
   </w:sdt>
   <w:p>
     <w:pPr>
-      <w:pStyle w:val="af2"/>
+      <w:pStyle w:val="Footer"/>
     </w:pPr>
   </w:p>
 </w:ftr>
@@ -12505,16 +12866,16 @@
     <w:lsdException w:name="Unresolved Mention" w:semiHidden="1" w:unhideWhenUsed="1"/>
     <w:lsdException w:name="Smart Link" w:semiHidden="1" w:unhideWhenUsed="1"/>
   </w:latentStyles>
-  <w:style w:type="paragraph" w:default="1" w:styleId="a">
+  <w:style w:type="paragraph" w:default="1" w:styleId="Normal">
     <w:name w:val="Normal"/>
     <w:qFormat/>
     <w:rsid w:val="00FD23F6"/>
   </w:style>
-  <w:style w:type="paragraph" w:styleId="1">
+  <w:style w:type="paragraph" w:styleId="Heading1">
     <w:name w:val="heading 1"/>
-    <w:basedOn w:val="a"/>
-    <w:next w:val="a"/>
-    <w:link w:val="10"/>
+    <w:basedOn w:val="Normal"/>
+    <w:next w:val="Normal"/>
+    <w:link w:val="Heading1Char"/>
     <w:uiPriority w:val="9"/>
     <w:qFormat/>
     <w:rsid w:val="00D0036D"/>
@@ -12531,11 +12892,11 @@
       <w:szCs w:val="40"/>
     </w:rPr>
   </w:style>
-  <w:style w:type="paragraph" w:styleId="2">
+  <w:style w:type="paragraph" w:styleId="Heading2">
     <w:name w:val="heading 2"/>
-    <w:basedOn w:val="a"/>
-    <w:next w:val="a"/>
-    <w:link w:val="20"/>
+    <w:basedOn w:val="Normal"/>
+    <w:next w:val="Normal"/>
+    <w:link w:val="Heading2Char"/>
     <w:uiPriority w:val="9"/>
     <w:semiHidden/>
     <w:unhideWhenUsed/>
@@ -12554,11 +12915,11 @@
       <w:szCs w:val="32"/>
     </w:rPr>
   </w:style>
-  <w:style w:type="paragraph" w:styleId="3">
+  <w:style w:type="paragraph" w:styleId="Heading3">
     <w:name w:val="heading 3"/>
-    <w:basedOn w:val="a"/>
-    <w:next w:val="a"/>
-    <w:link w:val="30"/>
+    <w:basedOn w:val="Normal"/>
+    <w:next w:val="Normal"/>
+    <w:link w:val="Heading3Char"/>
     <w:uiPriority w:val="9"/>
     <w:semiHidden/>
     <w:unhideWhenUsed/>
@@ -12577,11 +12938,11 @@
       <w:szCs w:val="28"/>
     </w:rPr>
   </w:style>
-  <w:style w:type="paragraph" w:styleId="4">
+  <w:style w:type="paragraph" w:styleId="Heading4">
     <w:name w:val="heading 4"/>
-    <w:basedOn w:val="a"/>
-    <w:next w:val="a"/>
-    <w:link w:val="40"/>
+    <w:basedOn w:val="Normal"/>
+    <w:next w:val="Normal"/>
+    <w:link w:val="Heading4Char"/>
     <w:uiPriority w:val="9"/>
     <w:semiHidden/>
     <w:unhideWhenUsed/>
@@ -12600,11 +12961,11 @@
       <w:color w:val="0F4761" w:themeColor="accent1" w:themeShade="BF"/>
     </w:rPr>
   </w:style>
-  <w:style w:type="paragraph" w:styleId="5">
+  <w:style w:type="paragraph" w:styleId="Heading5">
     <w:name w:val="heading 5"/>
-    <w:basedOn w:val="a"/>
-    <w:next w:val="a"/>
-    <w:link w:val="50"/>
+    <w:basedOn w:val="Normal"/>
+    <w:next w:val="Normal"/>
+    <w:link w:val="Heading5Char"/>
     <w:uiPriority w:val="9"/>
     <w:semiHidden/>
     <w:unhideWhenUsed/>
@@ -12621,11 +12982,11 @@
       <w:color w:val="0F4761" w:themeColor="accent1" w:themeShade="BF"/>
     </w:rPr>
   </w:style>
-  <w:style w:type="paragraph" w:styleId="6">
+  <w:style w:type="paragraph" w:styleId="Heading6">
     <w:name w:val="heading 6"/>
-    <w:basedOn w:val="a"/>
-    <w:next w:val="a"/>
-    <w:link w:val="60"/>
+    <w:basedOn w:val="Normal"/>
+    <w:next w:val="Normal"/>
+    <w:link w:val="Heading6Char"/>
     <w:uiPriority w:val="9"/>
     <w:semiHidden/>
     <w:unhideWhenUsed/>
@@ -12644,11 +13005,11 @@
       <w:color w:val="595959" w:themeColor="text1" w:themeTint="A6"/>
     </w:rPr>
   </w:style>
-  <w:style w:type="paragraph" w:styleId="7">
+  <w:style w:type="paragraph" w:styleId="Heading7">
     <w:name w:val="heading 7"/>
-    <w:basedOn w:val="a"/>
-    <w:next w:val="a"/>
-    <w:link w:val="70"/>
+    <w:basedOn w:val="Normal"/>
+    <w:next w:val="Normal"/>
+    <w:link w:val="Heading7Char"/>
     <w:uiPriority w:val="9"/>
     <w:semiHidden/>
     <w:unhideWhenUsed/>
@@ -12665,11 +13026,11 @@
       <w:color w:val="595959" w:themeColor="text1" w:themeTint="A6"/>
     </w:rPr>
   </w:style>
-  <w:style w:type="paragraph" w:styleId="8">
+  <w:style w:type="paragraph" w:styleId="Heading8">
     <w:name w:val="heading 8"/>
-    <w:basedOn w:val="a"/>
-    <w:next w:val="a"/>
-    <w:link w:val="80"/>
+    <w:basedOn w:val="Normal"/>
+    <w:next w:val="Normal"/>
+    <w:link w:val="Heading8Char"/>
     <w:uiPriority w:val="9"/>
     <w:semiHidden/>
     <w:unhideWhenUsed/>
@@ -12688,11 +13049,11 @@
       <w:color w:val="272727" w:themeColor="text1" w:themeTint="D8"/>
     </w:rPr>
   </w:style>
-  <w:style w:type="paragraph" w:styleId="9">
+  <w:style w:type="paragraph" w:styleId="Heading9">
     <w:name w:val="heading 9"/>
-    <w:basedOn w:val="a"/>
-    <w:next w:val="a"/>
-    <w:link w:val="90"/>
+    <w:basedOn w:val="Normal"/>
+    <w:next w:val="Normal"/>
+    <w:link w:val="Heading9Char"/>
     <w:uiPriority w:val="9"/>
     <w:semiHidden/>
     <w:unhideWhenUsed/>
@@ -12709,13 +13070,12 @@
       <w:color w:val="272727" w:themeColor="text1" w:themeTint="D8"/>
     </w:rPr>
   </w:style>
-  <w:style w:type="character" w:default="1" w:styleId="a0">
+  <w:style w:type="character" w:default="1" w:styleId="DefaultParagraphFont">
     <w:name w:val="Default Paragraph Font"/>
     <w:uiPriority w:val="1"/>
-    <w:semiHidden/>
     <w:unhideWhenUsed/>
   </w:style>
-  <w:style w:type="table" w:default="1" w:styleId="a1">
+  <w:style w:type="table" w:default="1" w:styleId="TableNormal">
     <w:name w:val="Normal Table"/>
     <w:uiPriority w:val="99"/>
     <w:semiHidden/>
@@ -12730,16 +13090,16 @@
       </w:tblCellMar>
     </w:tblPr>
   </w:style>
-  <w:style w:type="numbering" w:default="1" w:styleId="a2">
+  <w:style w:type="numbering" w:default="1" w:styleId="NoList">
     <w:name w:val="No List"/>
     <w:uiPriority w:val="99"/>
     <w:semiHidden/>
     <w:unhideWhenUsed/>
   </w:style>
-  <w:style w:type="character" w:customStyle="1" w:styleId="10">
-    <w:name w:val="כותרת 1 תו"/>
-    <w:basedOn w:val="a0"/>
-    <w:link w:val="1"/>
+  <w:style w:type="character" w:customStyle="1" w:styleId="Heading1Char">
+    <w:name w:val="Heading 1 Char"/>
+    <w:basedOn w:val="DefaultParagraphFont"/>
+    <w:link w:val="Heading1"/>
     <w:uiPriority w:val="9"/>
     <w:rsid w:val="00D0036D"/>
     <w:rPr>
@@ -12749,10 +13109,10 @@
       <w:szCs w:val="40"/>
     </w:rPr>
   </w:style>
-  <w:style w:type="character" w:customStyle="1" w:styleId="20">
-    <w:name w:val="כותרת 2 תו"/>
-    <w:basedOn w:val="a0"/>
-    <w:link w:val="2"/>
+  <w:style w:type="character" w:customStyle="1" w:styleId="Heading2Char">
+    <w:name w:val="Heading 2 Char"/>
+    <w:basedOn w:val="DefaultParagraphFont"/>
+    <w:link w:val="Heading2"/>
     <w:uiPriority w:val="9"/>
     <w:semiHidden/>
     <w:rsid w:val="00D0036D"/>
@@ -12763,10 +13123,10 @@
       <w:szCs w:val="32"/>
     </w:rPr>
   </w:style>
-  <w:style w:type="character" w:customStyle="1" w:styleId="30">
-    <w:name w:val="כותרת 3 תו"/>
-    <w:basedOn w:val="a0"/>
-    <w:link w:val="3"/>
+  <w:style w:type="character" w:customStyle="1" w:styleId="Heading3Char">
+    <w:name w:val="Heading 3 Char"/>
+    <w:basedOn w:val="DefaultParagraphFont"/>
+    <w:link w:val="Heading3"/>
     <w:uiPriority w:val="9"/>
     <w:semiHidden/>
     <w:rsid w:val="00D0036D"/>
@@ -12777,10 +13137,10 @@
       <w:szCs w:val="28"/>
     </w:rPr>
   </w:style>
-  <w:style w:type="character" w:customStyle="1" w:styleId="40">
-    <w:name w:val="כותרת 4 תו"/>
-    <w:basedOn w:val="a0"/>
-    <w:link w:val="4"/>
+  <w:style w:type="character" w:customStyle="1" w:styleId="Heading4Char">
+    <w:name w:val="Heading 4 Char"/>
+    <w:basedOn w:val="DefaultParagraphFont"/>
+    <w:link w:val="Heading4"/>
     <w:uiPriority w:val="9"/>
     <w:semiHidden/>
     <w:rsid w:val="00D0036D"/>
@@ -12791,10 +13151,10 @@
       <w:color w:val="0F4761" w:themeColor="accent1" w:themeShade="BF"/>
     </w:rPr>
   </w:style>
-  <w:style w:type="character" w:customStyle="1" w:styleId="50">
-    <w:name w:val="כותרת 5 תו"/>
-    <w:basedOn w:val="a0"/>
-    <w:link w:val="5"/>
+  <w:style w:type="character" w:customStyle="1" w:styleId="Heading5Char">
+    <w:name w:val="Heading 5 Char"/>
+    <w:basedOn w:val="DefaultParagraphFont"/>
+    <w:link w:val="Heading5"/>
     <w:uiPriority w:val="9"/>
     <w:semiHidden/>
     <w:rsid w:val="00D0036D"/>
@@ -12803,10 +13163,10 @@
       <w:color w:val="0F4761" w:themeColor="accent1" w:themeShade="BF"/>
     </w:rPr>
   </w:style>
-  <w:style w:type="character" w:customStyle="1" w:styleId="60">
-    <w:name w:val="כותרת 6 תו"/>
-    <w:basedOn w:val="a0"/>
-    <w:link w:val="6"/>
+  <w:style w:type="character" w:customStyle="1" w:styleId="Heading6Char">
+    <w:name w:val="Heading 6 Char"/>
+    <w:basedOn w:val="DefaultParagraphFont"/>
+    <w:link w:val="Heading6"/>
     <w:uiPriority w:val="9"/>
     <w:semiHidden/>
     <w:rsid w:val="00D0036D"/>
@@ -12817,10 +13177,10 @@
       <w:color w:val="595959" w:themeColor="text1" w:themeTint="A6"/>
     </w:rPr>
   </w:style>
-  <w:style w:type="character" w:customStyle="1" w:styleId="70">
-    <w:name w:val="כותרת 7 תו"/>
-    <w:basedOn w:val="a0"/>
-    <w:link w:val="7"/>
+  <w:style w:type="character" w:customStyle="1" w:styleId="Heading7Char">
+    <w:name w:val="Heading 7 Char"/>
+    <w:basedOn w:val="DefaultParagraphFont"/>
+    <w:link w:val="Heading7"/>
     <w:uiPriority w:val="9"/>
     <w:semiHidden/>
     <w:rsid w:val="00D0036D"/>
@@ -12829,10 +13189,10 @@
       <w:color w:val="595959" w:themeColor="text1" w:themeTint="A6"/>
     </w:rPr>
   </w:style>
-  <w:style w:type="character" w:customStyle="1" w:styleId="80">
-    <w:name w:val="כותרת 8 תו"/>
-    <w:basedOn w:val="a0"/>
-    <w:link w:val="8"/>
+  <w:style w:type="character" w:customStyle="1" w:styleId="Heading8Char">
+    <w:name w:val="Heading 8 Char"/>
+    <w:basedOn w:val="DefaultParagraphFont"/>
+    <w:link w:val="Heading8"/>
     <w:uiPriority w:val="9"/>
     <w:semiHidden/>
     <w:rsid w:val="00D0036D"/>
@@ -12843,10 +13203,10 @@
       <w:color w:val="272727" w:themeColor="text1" w:themeTint="D8"/>
     </w:rPr>
   </w:style>
-  <w:style w:type="character" w:customStyle="1" w:styleId="90">
-    <w:name w:val="כותרת 9 תו"/>
-    <w:basedOn w:val="a0"/>
-    <w:link w:val="9"/>
+  <w:style w:type="character" w:customStyle="1" w:styleId="Heading9Char">
+    <w:name w:val="Heading 9 Char"/>
+    <w:basedOn w:val="DefaultParagraphFont"/>
+    <w:link w:val="Heading9"/>
     <w:uiPriority w:val="9"/>
     <w:semiHidden/>
     <w:rsid w:val="00D0036D"/>
@@ -12855,11 +13215,11 @@
       <w:color w:val="272727" w:themeColor="text1" w:themeTint="D8"/>
     </w:rPr>
   </w:style>
-  <w:style w:type="paragraph" w:styleId="a3">
+  <w:style w:type="paragraph" w:styleId="Title">
     <w:name w:val="Title"/>
-    <w:basedOn w:val="a"/>
-    <w:next w:val="a"/>
-    <w:link w:val="a4"/>
+    <w:basedOn w:val="Normal"/>
+    <w:next w:val="Normal"/>
+    <w:link w:val="TitleChar"/>
     <w:uiPriority w:val="10"/>
     <w:qFormat/>
     <w:rsid w:val="00D0036D"/>
@@ -12875,10 +13235,10 @@
       <w:szCs w:val="56"/>
     </w:rPr>
   </w:style>
-  <w:style w:type="character" w:customStyle="1" w:styleId="a4">
-    <w:name w:val="כותרת טקסט תו"/>
-    <w:basedOn w:val="a0"/>
-    <w:link w:val="a3"/>
+  <w:style w:type="character" w:customStyle="1" w:styleId="TitleChar">
+    <w:name w:val="Title Char"/>
+    <w:basedOn w:val="DefaultParagraphFont"/>
+    <w:link w:val="Title"/>
     <w:uiPriority w:val="10"/>
     <w:rsid w:val="00D0036D"/>
     <w:rPr>
@@ -12889,11 +13249,11 @@
       <w:szCs w:val="56"/>
     </w:rPr>
   </w:style>
-  <w:style w:type="paragraph" w:styleId="a5">
+  <w:style w:type="paragraph" w:styleId="Subtitle">
     <w:name w:val="Subtitle"/>
-    <w:basedOn w:val="a"/>
-    <w:next w:val="a"/>
-    <w:link w:val="a6"/>
+    <w:basedOn w:val="Normal"/>
+    <w:next w:val="Normal"/>
+    <w:link w:val="SubtitleChar"/>
     <w:uiPriority w:val="11"/>
     <w:qFormat/>
     <w:rsid w:val="00D0036D"/>
@@ -12910,10 +13270,10 @@
       <w:szCs w:val="28"/>
     </w:rPr>
   </w:style>
-  <w:style w:type="character" w:customStyle="1" w:styleId="a6">
-    <w:name w:val="כותרת משנה תו"/>
-    <w:basedOn w:val="a0"/>
-    <w:link w:val="a5"/>
+  <w:style w:type="character" w:customStyle="1" w:styleId="SubtitleChar">
+    <w:name w:val="Subtitle Char"/>
+    <w:basedOn w:val="DefaultParagraphFont"/>
+    <w:link w:val="Subtitle"/>
     <w:uiPriority w:val="11"/>
     <w:rsid w:val="00D0036D"/>
     <w:rPr>
@@ -12924,11 +13284,11 @@
       <w:szCs w:val="28"/>
     </w:rPr>
   </w:style>
-  <w:style w:type="paragraph" w:styleId="a7">
+  <w:style w:type="paragraph" w:styleId="Quote">
     <w:name w:val="Quote"/>
-    <w:basedOn w:val="a"/>
-    <w:next w:val="a"/>
-    <w:link w:val="a8"/>
+    <w:basedOn w:val="Normal"/>
+    <w:next w:val="Normal"/>
+    <w:link w:val="QuoteChar"/>
     <w:uiPriority w:val="29"/>
     <w:qFormat/>
     <w:rsid w:val="00D0036D"/>
@@ -12942,10 +13302,10 @@
       <w:color w:val="404040" w:themeColor="text1" w:themeTint="BF"/>
     </w:rPr>
   </w:style>
-  <w:style w:type="character" w:customStyle="1" w:styleId="a8">
-    <w:name w:val="ציטוט תו"/>
-    <w:basedOn w:val="a0"/>
-    <w:link w:val="a7"/>
+  <w:style w:type="character" w:customStyle="1" w:styleId="QuoteChar">
+    <w:name w:val="Quote Char"/>
+    <w:basedOn w:val="DefaultParagraphFont"/>
+    <w:link w:val="Quote"/>
     <w:uiPriority w:val="29"/>
     <w:rsid w:val="00D0036D"/>
     <w:rPr>
@@ -12954,9 +13314,9 @@
       <w:color w:val="404040" w:themeColor="text1" w:themeTint="BF"/>
     </w:rPr>
   </w:style>
-  <w:style w:type="paragraph" w:styleId="a9">
+  <w:style w:type="paragraph" w:styleId="ListParagraph">
     <w:name w:val="List Paragraph"/>
-    <w:basedOn w:val="a"/>
+    <w:basedOn w:val="Normal"/>
     <w:uiPriority w:val="34"/>
     <w:qFormat/>
     <w:rsid w:val="00D0036D"/>
@@ -12965,9 +13325,9 @@
       <w:contextualSpacing/>
     </w:pPr>
   </w:style>
-  <w:style w:type="character" w:styleId="aa">
+  <w:style w:type="character" w:styleId="IntenseEmphasis">
     <w:name w:val="Intense Emphasis"/>
-    <w:basedOn w:val="a0"/>
+    <w:basedOn w:val="DefaultParagraphFont"/>
     <w:uiPriority w:val="21"/>
     <w:qFormat/>
     <w:rsid w:val="00D0036D"/>
@@ -12977,11 +13337,11 @@
       <w:color w:val="0F4761" w:themeColor="accent1" w:themeShade="BF"/>
     </w:rPr>
   </w:style>
-  <w:style w:type="paragraph" w:styleId="ab">
+  <w:style w:type="paragraph" w:styleId="IntenseQuote">
     <w:name w:val="Intense Quote"/>
-    <w:basedOn w:val="a"/>
-    <w:next w:val="a"/>
-    <w:link w:val="ac"/>
+    <w:basedOn w:val="Normal"/>
+    <w:next w:val="Normal"/>
+    <w:link w:val="IntenseQuoteChar"/>
     <w:uiPriority w:val="30"/>
     <w:qFormat/>
     <w:rsid w:val="00D0036D"/>
@@ -13000,10 +13360,10 @@
       <w:color w:val="0F4761" w:themeColor="accent1" w:themeShade="BF"/>
     </w:rPr>
   </w:style>
-  <w:style w:type="character" w:customStyle="1" w:styleId="ac">
-    <w:name w:val="ציטוט חזק תו"/>
-    <w:basedOn w:val="a0"/>
-    <w:link w:val="ab"/>
+  <w:style w:type="character" w:customStyle="1" w:styleId="IntenseQuoteChar">
+    <w:name w:val="Intense Quote Char"/>
+    <w:basedOn w:val="DefaultParagraphFont"/>
+    <w:link w:val="IntenseQuote"/>
     <w:uiPriority w:val="30"/>
     <w:rsid w:val="00D0036D"/>
     <w:rPr>
@@ -13012,9 +13372,9 @@
       <w:color w:val="0F4761" w:themeColor="accent1" w:themeShade="BF"/>
     </w:rPr>
   </w:style>
-  <w:style w:type="character" w:styleId="ad">
+  <w:style w:type="character" w:styleId="IntenseReference">
     <w:name w:val="Intense Reference"/>
-    <w:basedOn w:val="a0"/>
+    <w:basedOn w:val="DefaultParagraphFont"/>
     <w:uiPriority w:val="32"/>
     <w:qFormat/>
     <w:rsid w:val="00D0036D"/>
@@ -13026,10 +13386,10 @@
       <w:spacing w:val="5"/>
     </w:rPr>
   </w:style>
-  <w:style w:type="paragraph" w:styleId="HTML">
+  <w:style w:type="paragraph" w:styleId="HTMLPreformatted">
     <w:name w:val="HTML Preformatted"/>
-    <w:basedOn w:val="a"/>
-    <w:link w:val="HTML0"/>
+    <w:basedOn w:val="Normal"/>
+    <w:link w:val="HTMLPreformattedChar"/>
     <w:uiPriority w:val="99"/>
     <w:semiHidden/>
     <w:unhideWhenUsed/>
@@ -13043,10 +13403,10 @@
       <w:szCs w:val="20"/>
     </w:rPr>
   </w:style>
-  <w:style w:type="character" w:customStyle="1" w:styleId="HTML0">
-    <w:name w:val="HTML מעוצב מראש תו"/>
-    <w:basedOn w:val="a0"/>
-    <w:link w:val="HTML"/>
+  <w:style w:type="character" w:customStyle="1" w:styleId="HTMLPreformattedChar">
+    <w:name w:val="HTML Preformatted Char"/>
+    <w:basedOn w:val="DefaultParagraphFont"/>
+    <w:link w:val="HTMLPreformatted"/>
     <w:uiPriority w:val="99"/>
     <w:semiHidden/>
     <w:rsid w:val="005B7D19"/>
@@ -13056,9 +13416,9 @@
       <w:szCs w:val="20"/>
     </w:rPr>
   </w:style>
-  <w:style w:type="paragraph" w:styleId="ae">
+  <w:style w:type="paragraph" w:styleId="NoSpacing">
     <w:name w:val="No Spacing"/>
-    <w:link w:val="af"/>
+    <w:link w:val="NoSpacingChar"/>
     <w:uiPriority w:val="1"/>
     <w:qFormat/>
     <w:rsid w:val="00D75B81"/>
@@ -13074,10 +13434,10 @@
       <w14:ligatures w14:val="none"/>
     </w:rPr>
   </w:style>
-  <w:style w:type="character" w:customStyle="1" w:styleId="af">
-    <w:name w:val="ללא מרווח תו"/>
-    <w:basedOn w:val="a0"/>
-    <w:link w:val="ae"/>
+  <w:style w:type="character" w:customStyle="1" w:styleId="NoSpacingChar">
+    <w:name w:val="No Spacing Char"/>
+    <w:basedOn w:val="DefaultParagraphFont"/>
+    <w:link w:val="NoSpacing"/>
     <w:uiPriority w:val="1"/>
     <w:rsid w:val="00D75B81"/>
     <w:rPr>
@@ -13089,10 +13449,10 @@
       <w14:ligatures w14:val="none"/>
     </w:rPr>
   </w:style>
-  <w:style w:type="paragraph" w:styleId="af0">
+  <w:style w:type="paragraph" w:styleId="Header">
     <w:name w:val="header"/>
-    <w:basedOn w:val="a"/>
-    <w:link w:val="af1"/>
+    <w:basedOn w:val="Normal"/>
+    <w:link w:val="HeaderChar"/>
     <w:uiPriority w:val="99"/>
     <w:unhideWhenUsed/>
     <w:rsid w:val="00D75B81"/>
@@ -13104,17 +13464,17 @@
       <w:spacing w:after="0" w:line="240" w:lineRule="auto"/>
     </w:pPr>
   </w:style>
-  <w:style w:type="character" w:customStyle="1" w:styleId="af1">
-    <w:name w:val="כותרת עליונה תו"/>
-    <w:basedOn w:val="a0"/>
-    <w:link w:val="af0"/>
+  <w:style w:type="character" w:customStyle="1" w:styleId="HeaderChar">
+    <w:name w:val="Header Char"/>
+    <w:basedOn w:val="DefaultParagraphFont"/>
+    <w:link w:val="Header"/>
     <w:uiPriority w:val="99"/>
     <w:rsid w:val="00D75B81"/>
   </w:style>
-  <w:style w:type="paragraph" w:styleId="af2">
+  <w:style w:type="paragraph" w:styleId="Footer">
     <w:name w:val="footer"/>
-    <w:basedOn w:val="a"/>
-    <w:link w:val="af3"/>
+    <w:basedOn w:val="Normal"/>
+    <w:link w:val="FooterChar"/>
     <w:uiPriority w:val="99"/>
     <w:unhideWhenUsed/>
     <w:rsid w:val="00D75B81"/>
@@ -13126,10 +13486,10 @@
       <w:spacing w:after="0" w:line="240" w:lineRule="auto"/>
     </w:pPr>
   </w:style>
-  <w:style w:type="character" w:customStyle="1" w:styleId="af3">
-    <w:name w:val="כותרת תחתונה תו"/>
-    <w:basedOn w:val="a0"/>
-    <w:link w:val="af2"/>
+  <w:style w:type="character" w:customStyle="1" w:styleId="FooterChar">
+    <w:name w:val="Footer Char"/>
+    <w:basedOn w:val="DefaultParagraphFont"/>
+    <w:link w:val="Footer"/>
     <w:uiPriority w:val="99"/>
     <w:rsid w:val="00D75B81"/>
   </w:style>

</xml_diff>